<commit_message>
Beoordelingsformulier CAT Master Kinderfysiotherapie toevoegen
Criteria uit deel B van de Breederode-handleiding (MKF26-WO1-CAT-1-5).
Samengeperste cellen uit elkaar getrokken tot losse criteria, feedbackkolom
per criterium en eindoordeel onderaan, zoals de handleiding het beschrijft.
build.py draait nu over een lijst formulieren in plaats van over een.

Co-Authored-By: Claude Opus 5 <noreply@anthropic.com>
Claude-Session: https://claude.ai/code/session_01MFxNGbwmCoegqVpKkEyWGh
</commit_message>
<xml_diff>
--- a/Platform/beoordelingsformulieren/beoordelingsformulier-cat-diagnostiek.docx
+++ b/Platform/beoordelingsformulieren/beoordelingsformulier-cat-diagnostiek.docx
@@ -66,7 +66,7 @@
       <w:tr>
         <w:tc>
           <w:tcPr>
-            <w:tcW w:type="dxa" w:w="7483"/>
+            <w:tcW w:type="dxa" w:w="7517"/>
             <w:vAlign w:val="center"/>
             <w:shd w:val="clear" w:fill="D9D9D9"/>
           </w:tcPr>
@@ -86,7 +86,7 @@
         </w:tc>
         <w:tc>
           <w:tcPr>
-            <w:tcW w:type="dxa" w:w="2154"/>
+            <w:tcW w:type="dxa" w:w="2120"/>
             <w:vAlign w:val="center"/>
             <w:shd w:val="clear" w:fill="D9D9D9"/>
           </w:tcPr>
@@ -109,7 +109,7 @@
       <w:tr>
         <w:tc>
           <w:tcPr>
-            <w:tcW w:type="dxa" w:w="2154"/>
+            <w:tcW w:type="dxa" w:w="2120"/>
             <w:gridSpan w:val="2"/>
             <w:vAlign w:val="center"/>
             <w:shd w:val="clear" w:fill="F2F2F2"/>
@@ -132,7 +132,7 @@
       <w:tr>
         <w:tc>
           <w:tcPr>
-            <w:tcW w:type="dxa" w:w="7483"/>
+            <w:tcW w:type="dxa" w:w="7517"/>
             <w:vAlign w:val="center"/>
           </w:tcPr>
           <w:p>
@@ -151,7 +151,7 @@
         </w:tc>
         <w:tc>
           <w:tcPr>
-            <w:tcW w:type="dxa" w:w="2154"/>
+            <w:tcW w:type="dxa" w:w="2120"/>
             <w:vAlign w:val="center"/>
           </w:tcPr>
           <w:p>
@@ -171,7 +171,7 @@
       <w:tr>
         <w:tc>
           <w:tcPr>
-            <w:tcW w:type="dxa" w:w="7483"/>
+            <w:tcW w:type="dxa" w:w="7517"/>
             <w:vAlign w:val="center"/>
           </w:tcPr>
           <w:p>
@@ -190,7 +190,7 @@
         </w:tc>
         <w:tc>
           <w:tcPr>
-            <w:tcW w:type="dxa" w:w="2154"/>
+            <w:tcW w:type="dxa" w:w="2120"/>
             <w:vAlign w:val="center"/>
           </w:tcPr>
           <w:p>
@@ -210,7 +210,7 @@
       <w:tr>
         <w:tc>
           <w:tcPr>
-            <w:tcW w:type="dxa" w:w="7483"/>
+            <w:tcW w:type="dxa" w:w="7517"/>
             <w:vAlign w:val="center"/>
           </w:tcPr>
           <w:p>
@@ -229,7 +229,7 @@
         </w:tc>
         <w:tc>
           <w:tcPr>
-            <w:tcW w:type="dxa" w:w="2154"/>
+            <w:tcW w:type="dxa" w:w="2120"/>
             <w:vAlign w:val="center"/>
           </w:tcPr>
           <w:p>
@@ -249,7 +249,7 @@
       <w:tr>
         <w:tc>
           <w:tcPr>
-            <w:tcW w:type="dxa" w:w="7483"/>
+            <w:tcW w:type="dxa" w:w="7517"/>
             <w:vAlign w:val="center"/>
           </w:tcPr>
           <w:p>
@@ -268,7 +268,7 @@
         </w:tc>
         <w:tc>
           <w:tcPr>
-            <w:tcW w:type="dxa" w:w="2154"/>
+            <w:tcW w:type="dxa" w:w="2120"/>
             <w:vAlign w:val="center"/>
           </w:tcPr>
           <w:p>
@@ -288,7 +288,7 @@
       <w:tr>
         <w:tc>
           <w:tcPr>
-            <w:tcW w:type="dxa" w:w="2154"/>
+            <w:tcW w:type="dxa" w:w="2120"/>
             <w:gridSpan w:val="2"/>
             <w:vAlign w:val="center"/>
             <w:shd w:val="clear" w:fill="F2F2F2"/>
@@ -311,7 +311,7 @@
       <w:tr>
         <w:tc>
           <w:tcPr>
-            <w:tcW w:type="dxa" w:w="7483"/>
+            <w:tcW w:type="dxa" w:w="7517"/>
             <w:vAlign w:val="center"/>
           </w:tcPr>
           <w:p>
@@ -330,7 +330,7 @@
         </w:tc>
         <w:tc>
           <w:tcPr>
-            <w:tcW w:type="dxa" w:w="2154"/>
+            <w:tcW w:type="dxa" w:w="2120"/>
             <w:vAlign w:val="center"/>
           </w:tcPr>
           <w:p>
@@ -350,7 +350,7 @@
       <w:tr>
         <w:tc>
           <w:tcPr>
-            <w:tcW w:type="dxa" w:w="7483"/>
+            <w:tcW w:type="dxa" w:w="7517"/>
             <w:vAlign w:val="center"/>
           </w:tcPr>
           <w:p>
@@ -369,7 +369,7 @@
         </w:tc>
         <w:tc>
           <w:tcPr>
-            <w:tcW w:type="dxa" w:w="2154"/>
+            <w:tcW w:type="dxa" w:w="2120"/>
             <w:vAlign w:val="center"/>
           </w:tcPr>
           <w:p>
@@ -389,7 +389,7 @@
       <w:tr>
         <w:tc>
           <w:tcPr>
-            <w:tcW w:type="dxa" w:w="7483"/>
+            <w:tcW w:type="dxa" w:w="7517"/>
             <w:vAlign w:val="center"/>
           </w:tcPr>
           <w:p>
@@ -408,7 +408,7 @@
         </w:tc>
         <w:tc>
           <w:tcPr>
-            <w:tcW w:type="dxa" w:w="2154"/>
+            <w:tcW w:type="dxa" w:w="2120"/>
             <w:vAlign w:val="center"/>
           </w:tcPr>
           <w:p>
@@ -428,7 +428,7 @@
       <w:tr>
         <w:tc>
           <w:tcPr>
-            <w:tcW w:type="dxa" w:w="2154"/>
+            <w:tcW w:type="dxa" w:w="2120"/>
             <w:gridSpan w:val="2"/>
             <w:vAlign w:val="center"/>
             <w:shd w:val="clear" w:fill="F2F2F2"/>
@@ -451,7 +451,7 @@
       <w:tr>
         <w:tc>
           <w:tcPr>
-            <w:tcW w:type="dxa" w:w="7483"/>
+            <w:tcW w:type="dxa" w:w="7517"/>
             <w:vAlign w:val="center"/>
           </w:tcPr>
           <w:p>
@@ -470,7 +470,7 @@
         </w:tc>
         <w:tc>
           <w:tcPr>
-            <w:tcW w:type="dxa" w:w="2154"/>
+            <w:tcW w:type="dxa" w:w="2120"/>
             <w:vAlign w:val="center"/>
           </w:tcPr>
           <w:p>
@@ -490,7 +490,7 @@
       <w:tr>
         <w:tc>
           <w:tcPr>
-            <w:tcW w:type="dxa" w:w="7483"/>
+            <w:tcW w:type="dxa" w:w="7517"/>
             <w:vAlign w:val="center"/>
           </w:tcPr>
           <w:p>
@@ -509,7 +509,7 @@
         </w:tc>
         <w:tc>
           <w:tcPr>
-            <w:tcW w:type="dxa" w:w="2154"/>
+            <w:tcW w:type="dxa" w:w="2120"/>
             <w:vAlign w:val="center"/>
           </w:tcPr>
           <w:p>
@@ -529,7 +529,7 @@
       <w:tr>
         <w:tc>
           <w:tcPr>
-            <w:tcW w:type="dxa" w:w="7483"/>
+            <w:tcW w:type="dxa" w:w="7517"/>
             <w:vAlign w:val="center"/>
           </w:tcPr>
           <w:p>
@@ -548,7 +548,7 @@
         </w:tc>
         <w:tc>
           <w:tcPr>
-            <w:tcW w:type="dxa" w:w="2154"/>
+            <w:tcW w:type="dxa" w:w="2120"/>
             <w:vAlign w:val="center"/>
           </w:tcPr>
           <w:p>
@@ -568,7 +568,7 @@
       <w:tr>
         <w:tc>
           <w:tcPr>
-            <w:tcW w:type="dxa" w:w="7483"/>
+            <w:tcW w:type="dxa" w:w="7517"/>
             <w:vAlign w:val="center"/>
           </w:tcPr>
           <w:p>
@@ -587,7 +587,7 @@
         </w:tc>
         <w:tc>
           <w:tcPr>
-            <w:tcW w:type="dxa" w:w="2154"/>
+            <w:tcW w:type="dxa" w:w="2120"/>
             <w:vAlign w:val="center"/>
           </w:tcPr>
           <w:p>
@@ -607,7 +607,7 @@
       <w:tr>
         <w:tc>
           <w:tcPr>
-            <w:tcW w:type="dxa" w:w="7483"/>
+            <w:tcW w:type="dxa" w:w="7517"/>
             <w:vAlign w:val="center"/>
           </w:tcPr>
           <w:p>
@@ -626,7 +626,7 @@
         </w:tc>
         <w:tc>
           <w:tcPr>
-            <w:tcW w:type="dxa" w:w="2154"/>
+            <w:tcW w:type="dxa" w:w="2120"/>
             <w:vAlign w:val="center"/>
           </w:tcPr>
           <w:p>
@@ -646,7 +646,7 @@
       <w:tr>
         <w:tc>
           <w:tcPr>
-            <w:tcW w:type="dxa" w:w="2154"/>
+            <w:tcW w:type="dxa" w:w="2120"/>
             <w:gridSpan w:val="2"/>
             <w:vAlign w:val="center"/>
             <w:shd w:val="clear" w:fill="F2F2F2"/>
@@ -669,7 +669,7 @@
       <w:tr>
         <w:tc>
           <w:tcPr>
-            <w:tcW w:type="dxa" w:w="7483"/>
+            <w:tcW w:type="dxa" w:w="7517"/>
             <w:vAlign w:val="center"/>
           </w:tcPr>
           <w:p>
@@ -688,7 +688,7 @@
         </w:tc>
         <w:tc>
           <w:tcPr>
-            <w:tcW w:type="dxa" w:w="2154"/>
+            <w:tcW w:type="dxa" w:w="2120"/>
             <w:vAlign w:val="center"/>
           </w:tcPr>
           <w:p>
@@ -708,7 +708,7 @@
       <w:tr>
         <w:tc>
           <w:tcPr>
-            <w:tcW w:type="dxa" w:w="7483"/>
+            <w:tcW w:type="dxa" w:w="7517"/>
             <w:vAlign w:val="center"/>
           </w:tcPr>
           <w:p>
@@ -727,7 +727,7 @@
         </w:tc>
         <w:tc>
           <w:tcPr>
-            <w:tcW w:type="dxa" w:w="2154"/>
+            <w:tcW w:type="dxa" w:w="2120"/>
             <w:vAlign w:val="center"/>
           </w:tcPr>
           <w:p>
@@ -747,7 +747,7 @@
       <w:tr>
         <w:tc>
           <w:tcPr>
-            <w:tcW w:type="dxa" w:w="7483"/>
+            <w:tcW w:type="dxa" w:w="7517"/>
             <w:vAlign w:val="center"/>
           </w:tcPr>
           <w:p>
@@ -766,7 +766,7 @@
         </w:tc>
         <w:tc>
           <w:tcPr>
-            <w:tcW w:type="dxa" w:w="2154"/>
+            <w:tcW w:type="dxa" w:w="2120"/>
             <w:vAlign w:val="center"/>
           </w:tcPr>
           <w:p>
@@ -786,7 +786,7 @@
       <w:tr>
         <w:tc>
           <w:tcPr>
-            <w:tcW w:type="dxa" w:w="7483"/>
+            <w:tcW w:type="dxa" w:w="7517"/>
             <w:vAlign w:val="center"/>
           </w:tcPr>
           <w:p>
@@ -805,7 +805,7 @@
         </w:tc>
         <w:tc>
           <w:tcPr>
-            <w:tcW w:type="dxa" w:w="2154"/>
+            <w:tcW w:type="dxa" w:w="2120"/>
             <w:vAlign w:val="center"/>
           </w:tcPr>
           <w:p>
@@ -825,7 +825,7 @@
       <w:tr>
         <w:tc>
           <w:tcPr>
-            <w:tcW w:type="dxa" w:w="7483"/>
+            <w:tcW w:type="dxa" w:w="7517"/>
             <w:vAlign w:val="center"/>
           </w:tcPr>
           <w:p>
@@ -844,7 +844,7 @@
         </w:tc>
         <w:tc>
           <w:tcPr>
-            <w:tcW w:type="dxa" w:w="2154"/>
+            <w:tcW w:type="dxa" w:w="2120"/>
             <w:vAlign w:val="center"/>
           </w:tcPr>
           <w:p>
@@ -864,7 +864,7 @@
       <w:tr>
         <w:tc>
           <w:tcPr>
-            <w:tcW w:type="dxa" w:w="7483"/>
+            <w:tcW w:type="dxa" w:w="7517"/>
             <w:vAlign w:val="center"/>
           </w:tcPr>
           <w:p>
@@ -883,7 +883,7 @@
         </w:tc>
         <w:tc>
           <w:tcPr>
-            <w:tcW w:type="dxa" w:w="2154"/>
+            <w:tcW w:type="dxa" w:w="2120"/>
             <w:vAlign w:val="center"/>
           </w:tcPr>
           <w:p>
@@ -903,7 +903,7 @@
       <w:tr>
         <w:tc>
           <w:tcPr>
-            <w:tcW w:type="dxa" w:w="2154"/>
+            <w:tcW w:type="dxa" w:w="2120"/>
             <w:gridSpan w:val="2"/>
             <w:vAlign w:val="center"/>
             <w:shd w:val="clear" w:fill="F2F2F2"/>
@@ -926,7 +926,7 @@
       <w:tr>
         <w:tc>
           <w:tcPr>
-            <w:tcW w:type="dxa" w:w="7483"/>
+            <w:tcW w:type="dxa" w:w="7517"/>
             <w:vAlign w:val="center"/>
           </w:tcPr>
           <w:p>
@@ -945,7 +945,7 @@
         </w:tc>
         <w:tc>
           <w:tcPr>
-            <w:tcW w:type="dxa" w:w="2154"/>
+            <w:tcW w:type="dxa" w:w="2120"/>
             <w:vAlign w:val="center"/>
           </w:tcPr>
           <w:p>
@@ -965,7 +965,7 @@
       <w:tr>
         <w:tc>
           <w:tcPr>
-            <w:tcW w:type="dxa" w:w="7483"/>
+            <w:tcW w:type="dxa" w:w="7517"/>
             <w:vAlign w:val="center"/>
           </w:tcPr>
           <w:p>
@@ -984,7 +984,7 @@
         </w:tc>
         <w:tc>
           <w:tcPr>
-            <w:tcW w:type="dxa" w:w="2154"/>
+            <w:tcW w:type="dxa" w:w="2120"/>
             <w:vAlign w:val="center"/>
           </w:tcPr>
           <w:p>
@@ -1004,7 +1004,7 @@
       <w:tr>
         <w:tc>
           <w:tcPr>
-            <w:tcW w:type="dxa" w:w="2154"/>
+            <w:tcW w:type="dxa" w:w="2120"/>
             <w:gridSpan w:val="2"/>
             <w:vAlign w:val="center"/>
             <w:shd w:val="clear" w:fill="F2F2F2"/>
@@ -1027,7 +1027,7 @@
       <w:tr>
         <w:tc>
           <w:tcPr>
-            <w:tcW w:type="dxa" w:w="7483"/>
+            <w:tcW w:type="dxa" w:w="7517"/>
             <w:vAlign w:val="center"/>
           </w:tcPr>
           <w:p>
@@ -1046,7 +1046,7 @@
         </w:tc>
         <w:tc>
           <w:tcPr>
-            <w:tcW w:type="dxa" w:w="2154"/>
+            <w:tcW w:type="dxa" w:w="2120"/>
             <w:vAlign w:val="center"/>
           </w:tcPr>
           <w:p>
@@ -1066,7 +1066,7 @@
       <w:tr>
         <w:tc>
           <w:tcPr>
-            <w:tcW w:type="dxa" w:w="7483"/>
+            <w:tcW w:type="dxa" w:w="7517"/>
             <w:vAlign w:val="center"/>
           </w:tcPr>
           <w:p>
@@ -1085,7 +1085,7 @@
         </w:tc>
         <w:tc>
           <w:tcPr>
-            <w:tcW w:type="dxa" w:w="2154"/>
+            <w:tcW w:type="dxa" w:w="2120"/>
             <w:vAlign w:val="center"/>
           </w:tcPr>
           <w:p>
@@ -1105,7 +1105,7 @@
       <w:tr>
         <w:tc>
           <w:tcPr>
-            <w:tcW w:type="dxa" w:w="2154"/>
+            <w:tcW w:type="dxa" w:w="2120"/>
             <w:gridSpan w:val="2"/>
             <w:vAlign w:val="center"/>
             <w:shd w:val="clear" w:fill="F2F2F2"/>
@@ -1128,7 +1128,7 @@
       <w:tr>
         <w:tc>
           <w:tcPr>
-            <w:tcW w:type="dxa" w:w="7483"/>
+            <w:tcW w:type="dxa" w:w="7517"/>
             <w:vAlign w:val="center"/>
           </w:tcPr>
           <w:p>
@@ -1147,7 +1147,7 @@
         </w:tc>
         <w:tc>
           <w:tcPr>
-            <w:tcW w:type="dxa" w:w="2154"/>
+            <w:tcW w:type="dxa" w:w="2120"/>
             <w:vAlign w:val="center"/>
           </w:tcPr>
           <w:p>
@@ -1167,7 +1167,7 @@
       <w:tr>
         <w:tc>
           <w:tcPr>
-            <w:tcW w:type="dxa" w:w="7483"/>
+            <w:tcW w:type="dxa" w:w="7517"/>
             <w:vAlign w:val="center"/>
           </w:tcPr>
           <w:p>
@@ -1186,7 +1186,7 @@
         </w:tc>
         <w:tc>
           <w:tcPr>
-            <w:tcW w:type="dxa" w:w="2154"/>
+            <w:tcW w:type="dxa" w:w="2120"/>
             <w:vAlign w:val="center"/>
           </w:tcPr>
           <w:p>
@@ -1206,7 +1206,7 @@
       <w:tr>
         <w:tc>
           <w:tcPr>
-            <w:tcW w:type="dxa" w:w="2154"/>
+            <w:tcW w:type="dxa" w:w="2120"/>
             <w:gridSpan w:val="2"/>
             <w:vAlign w:val="center"/>
             <w:shd w:val="clear" w:fill="F2F2F2"/>
@@ -1229,7 +1229,7 @@
       <w:tr>
         <w:tc>
           <w:tcPr>
-            <w:tcW w:type="dxa" w:w="7483"/>
+            <w:tcW w:type="dxa" w:w="7517"/>
             <w:vAlign w:val="center"/>
           </w:tcPr>
           <w:p>
@@ -1248,7 +1248,7 @@
         </w:tc>
         <w:tc>
           <w:tcPr>
-            <w:tcW w:type="dxa" w:w="2154"/>
+            <w:tcW w:type="dxa" w:w="2120"/>
             <w:vAlign w:val="center"/>
           </w:tcPr>
           <w:p>

</xml_diff>